<commit_message>
Make commitments in the Supplier's name, not one JV member's
The Proposer is the joint venture of RM Enterprise Limited and Inkript
Securities S.A.L, and both members are jointly and severally liable for
the whole Contract (ITP 4.1). The checklist, the Project Plan and the
Cybersecurity Risk Management Plan now make their commitments as the
Supplier, or as the Proposer where they speak of the bid itself, as the
System Architecture already does.

Inkript is still named for its own ISO/IEC 27001 and ISO 9001
certificates, as the joint venture member responsible for the
Information System. The penetration tester is now independent of the
Supplier rather than of Inkript alone, and checklist row 1.2.2.7 lists
the facility works rather than a facility works subcontract.

Co-Authored-By: Claude Opus 5.5 <noreply@anthropic.com>
Claude-Session: https://claude.ai/code/session_01G5KtDfxnVyqdZUVCaXFbWe
</commit_message>
<xml_diff>
--- a/Cybersecurity-Risk-Management-Plan.docx
+++ b/Cybersecurity-Risk-Management-Plan.docx
@@ -2503,7 +2503,7 @@
           <w:i w:val="false"/>
           <w:iCs w:val="false"/>
         </w:rPr>
-        <w:t xml:space="preserve"> provides the management system and the Annex A controls. Inkript's information security management system is certified to ISO/IEC 27001, and the certificate is included in the Technical Proposal.</w:t>
+        <w:t xml:space="preserve"> provides the management system and the Annex A controls. The information security management system of Inkript, the joint venture member responsible for the Information System, is certified to ISO/IEC 27001, and the certificate is included in the Technical Proposal.</w:t>
       </w:r>
     </w:p>
     <w:p>
@@ -3267,7 +3267,7 @@
           <w:i w:val="false"/>
           <w:iCs w:val="false"/>
         </w:rPr>
-        <w:t xml:space="preserve">Inkript remains the single point of accountability under ITP 16.2(b). Its obligations under GCC 44.1 are flowed down in writing to the equipment manufacturer, the card manufacturer and the facility works subcontractor, according to what each touches.</w:t>
+        <w:t xml:space="preserve">The Supplier remains the single point of accountability under ITP 16.2(b). Its obligations under GCC 44.1 are flowed down in writing to the equipment manufacturer, the card manufacturer and the facility works subcontractor, according to what each touches.</w:t>
       </w:r>
     </w:p>
     <w:p>
@@ -14913,7 +14913,7 @@
           <w:i w:val="false"/>
           <w:iCs w:val="false"/>
         </w:rPr>
-        <w:t xml:space="preserve">The penetration tester is independent of Inkript, and its scope and rules of engagement are approved by NRB before testing begins.</w:t>
+        <w:t xml:space="preserve">The penetration tester is independent of the Supplier, and its scope and rules of engagement are approved by NRB before testing begins.</w:t>
       </w:r>
     </w:p>
     <w:p>
@@ -20465,9 +20465,9 @@
         </w:tblBorders>
       </w:tblPr>
       <w:tblGrid>
-        <w:gridCol w:w="1822"/>
-        <w:gridCol w:w="5018"/>
-        <w:gridCol w:w="2180"/>
+        <w:gridCol w:w="1811"/>
+        <w:gridCol w:w="5043"/>
+        <w:gridCol w:w="2166"/>
       </w:tblGrid>
       <w:tr>
         <w:trPr>
@@ -20475,7 +20475,7 @@
         </w:trPr>
         <w:tc>
           <w:tcPr>
-            <w:tcW w:type="dxa" w:w="1822"/>
+            <w:tcW w:type="dxa" w:w="1811"/>
             <w:shd w:fill="EDEDED" w:val="clear"/>
             <w:tcMar>
               <w:top w:type="dxa" w:w="60"/>
@@ -20501,7 +20501,7 @@
         </w:tc>
         <w:tc>
           <w:tcPr>
-            <w:tcW w:type="dxa" w:w="5018"/>
+            <w:tcW w:type="dxa" w:w="5043"/>
             <w:shd w:fill="EDEDED" w:val="clear"/>
             <w:tcMar>
               <w:top w:type="dxa" w:w="60"/>
@@ -20527,7 +20527,7 @@
         </w:tc>
         <w:tc>
           <w:tcPr>
-            <w:tcW w:type="dxa" w:w="2180"/>
+            <w:tcW w:type="dxa" w:w="2166"/>
             <w:shd w:fill="EDEDED" w:val="clear"/>
             <w:tcMar>
               <w:top w:type="dxa" w:w="60"/>
@@ -20555,7 +20555,7 @@
       <w:tr>
         <w:tc>
           <w:tcPr>
-            <w:tcW w:type="dxa" w:w="1822"/>
+            <w:tcW w:type="dxa" w:w="1811"/>
             <w:tcMar>
               <w:top w:type="dxa" w:w="60"/>
               <w:left w:type="dxa" w:w="100"/>
@@ -20580,7 +20580,7 @@
         </w:tc>
         <w:tc>
           <w:tcPr>
-            <w:tcW w:type="dxa" w:w="5018"/>
+            <w:tcW w:type="dxa" w:w="5043"/>
             <w:tcMar>
               <w:top w:type="dxa" w:w="60"/>
               <w:left w:type="dxa" w:w="100"/>
@@ -20605,7 +20605,7 @@
         </w:tc>
         <w:tc>
           <w:tcPr>
-            <w:tcW w:type="dxa" w:w="2180"/>
+            <w:tcW w:type="dxa" w:w="2166"/>
             <w:tcMar>
               <w:top w:type="dxa" w:w="60"/>
               <w:left w:type="dxa" w:w="100"/>
@@ -20632,7 +20632,7 @@
       <w:tr>
         <w:tc>
           <w:tcPr>
-            <w:tcW w:type="dxa" w:w="1822"/>
+            <w:tcW w:type="dxa" w:w="1811"/>
             <w:tcMar>
               <w:top w:type="dxa" w:w="60"/>
               <w:left w:type="dxa" w:w="100"/>
@@ -20657,7 +20657,7 @@
         </w:tc>
         <w:tc>
           <w:tcPr>
-            <w:tcW w:type="dxa" w:w="5018"/>
+            <w:tcW w:type="dxa" w:w="5043"/>
             <w:tcMar>
               <w:top w:type="dxa" w:w="60"/>
               <w:left w:type="dxa" w:w="100"/>
@@ -20682,7 +20682,7 @@
         </w:tc>
         <w:tc>
           <w:tcPr>
-            <w:tcW w:type="dxa" w:w="2180"/>
+            <w:tcW w:type="dxa" w:w="2166"/>
             <w:tcMar>
               <w:top w:type="dxa" w:w="60"/>
               <w:left w:type="dxa" w:w="100"/>
@@ -20709,7 +20709,7 @@
       <w:tr>
         <w:tc>
           <w:tcPr>
-            <w:tcW w:type="dxa" w:w="1822"/>
+            <w:tcW w:type="dxa" w:w="1811"/>
             <w:tcMar>
               <w:top w:type="dxa" w:w="60"/>
               <w:left w:type="dxa" w:w="100"/>
@@ -20734,7 +20734,7 @@
         </w:tc>
         <w:tc>
           <w:tcPr>
-            <w:tcW w:type="dxa" w:w="5018"/>
+            <w:tcW w:type="dxa" w:w="5043"/>
             <w:tcMar>
               <w:top w:type="dxa" w:w="60"/>
               <w:left w:type="dxa" w:w="100"/>
@@ -20759,7 +20759,7 @@
         </w:tc>
         <w:tc>
           <w:tcPr>
-            <w:tcW w:type="dxa" w:w="2180"/>
+            <w:tcW w:type="dxa" w:w="2166"/>
             <w:tcMar>
               <w:top w:type="dxa" w:w="60"/>
               <w:left w:type="dxa" w:w="100"/>
@@ -20786,7 +20786,7 @@
       <w:tr>
         <w:tc>
           <w:tcPr>
-            <w:tcW w:type="dxa" w:w="1822"/>
+            <w:tcW w:type="dxa" w:w="1811"/>
             <w:tcMar>
               <w:top w:type="dxa" w:w="60"/>
               <w:left w:type="dxa" w:w="100"/>
@@ -20811,32 +20811,32 @@
         </w:tc>
         <w:tc>
           <w:tcPr>
-            <w:tcW w:type="dxa" w:w="5018"/>
-            <w:tcMar>
-              <w:top w:type="dxa" w:w="60"/>
-              <w:left w:type="dxa" w:w="100"/>
-              <w:bottom w:type="dxa" w:w="60"/>
-              <w:right w:type="dxa" w:w="100"/>
-            </w:tcMar>
-          </w:tcPr>
-          <w:p>
-            <w:pPr>
-              <w:spacing w:after="0" w:before="0"/>
-            </w:pPr>
-            <w:r>
-              <w:rPr>
-                <w:b w:val="false"/>
-                <w:bCs w:val="false"/>
-                <w:i w:val="false"/>
-                <w:iCs w:val="false"/>
-              </w:rPr>
-              <w:t xml:space="preserve">Independent of Inkript; CREST accredited or equivalent</w:t>
-            </w:r>
-          </w:p>
-        </w:tc>
-        <w:tc>
-          <w:tcPr>
-            <w:tcW w:type="dxa" w:w="2180"/>
+            <w:tcW w:type="dxa" w:w="5043"/>
+            <w:tcMar>
+              <w:top w:type="dxa" w:w="60"/>
+              <w:left w:type="dxa" w:w="100"/>
+              <w:bottom w:type="dxa" w:w="60"/>
+              <w:right w:type="dxa" w:w="100"/>
+            </w:tcMar>
+          </w:tcPr>
+          <w:p>
+            <w:pPr>
+              <w:spacing w:after="0" w:before="0"/>
+            </w:pPr>
+            <w:r>
+              <w:rPr>
+                <w:b w:val="false"/>
+                <w:bCs w:val="false"/>
+                <w:i w:val="false"/>
+                <w:iCs w:val="false"/>
+              </w:rPr>
+              <w:t xml:space="preserve">Independent of the Supplier; CREST accredited or equivalent</w:t>
+            </w:r>
+          </w:p>
+        </w:tc>
+        <w:tc>
+          <w:tcPr>
+            <w:tcW w:type="dxa" w:w="2166"/>
             <w:tcMar>
               <w:top w:type="dxa" w:w="60"/>
               <w:left w:type="dxa" w:w="100"/>
@@ -21792,7 +21792,7 @@
           <w:i w:val="false"/>
           <w:iCs w:val="false"/>
         </w:rPr>
-        <w:t xml:space="preserve">Inkript confirms that, if awarded the Contract, it will:</w:t>
+        <w:t xml:space="preserve">The Proposer confirms that, if awarded the Contract, it will:</w:t>
       </w:r>
     </w:p>
     <w:p>
@@ -21966,7 +21966,7 @@
           <w:i w:val="false"/>
           <w:iCs w:val="false"/>
         </w:rPr>
-        <w:t xml:space="preserve">maintain its ISO/IEC 27001 certification throughout the Contract; and</w:t>
+        <w:t xml:space="preserve">ensure that Inkript, the joint venture member responsible for the Information System, maintains its ISO/IEC 27001 certification throughout the Contract; and</w:t>
       </w:r>
     </w:p>
     <w:p>

</xml_diff>

<commit_message>
Give every bookmark its own id so Word keeps the cross-references
Every bookmark in the four Word documents came out with w:id="1",
because the docx library's Bookmark numbers each one from a fresh
counter. Word keeps only one bookmark per id, so once the fields were
updated (Ctrl+A then F9, or updating the contents table) every other
cross-reference read "Error! Reference source not found". LibreOffice
tolerates repeated ids, which is why the build's own checks passed.

The build now writes bookmark starts and ends itself, numbered once
across the document, and stops if any id repeats. The four documents
are rebuilt, and nothing changes in them except the bookmark ids.

Co-Authored-By: Claude Opus 5.5 <noreply@anthropic.com>
Claude-Session: https://claude.ai/code/session_01G5KtDfxnVyqdZUVCaXFbWe
</commit_message>
<xml_diff>
--- a/Cybersecurity-Risk-Management-Plan.docx
+++ b/Cybersecurity-Risk-Management-Plan.docx
@@ -821,7 +821,7 @@
       <w:r>
         <w:t xml:space="preserve">P</w:t>
       </w:r>
-      <w:bookmarkStart w:name="sec_1_1" w:id="1"/>
+      <w:bookmarkStart w:name="sec_1_1" w:id="2"/>
       <w:r>
         <w:rPr>
           <w:b w:val="false"/>
@@ -831,7 +831,7 @@
         </w:rPr>
         <w:t xml:space="preserve">urpose and scope</w:t>
       </w:r>
-      <w:bookmarkEnd w:id="1"/>
+      <w:bookmarkEnd w:id="2"/>
     </w:p>
     <w:p>
       <w:pPr>
@@ -2384,7 +2384,7 @@
       <w:r>
         <w:t xml:space="preserve">F</w:t>
       </w:r>
-      <w:bookmarkStart w:name="sec_1_2" w:id="1"/>
+      <w:bookmarkStart w:name="sec_1_2" w:id="3"/>
       <w:r>
         <w:rPr>
           <w:b w:val="false"/>
@@ -2394,7 +2394,7 @@
         </w:rPr>
         <w:t xml:space="preserve">rameworks and method</w:t>
       </w:r>
-      <w:bookmarkEnd w:id="1"/>
+      <w:bookmarkEnd w:id="3"/>
     </w:p>
     <w:p>
       <w:pPr>
@@ -2542,7 +2542,7 @@
       <w:r>
         <w:t xml:space="preserve">G</w:t>
       </w:r>
-      <w:bookmarkStart w:name="sec_2" w:id="1"/>
+      <w:bookmarkStart w:name="sec_2" w:id="4"/>
       <w:r>
         <w:rPr>
           <w:b w:val="false"/>
@@ -2552,7 +2552,7 @@
         </w:rPr>
         <w:t xml:space="preserve">overnance</w:t>
       </w:r>
-      <w:bookmarkEnd w:id="1"/>
+      <w:bookmarkEnd w:id="4"/>
     </w:p>
     <w:p>
       <w:pPr>
@@ -2566,7 +2566,7 @@
       <w:r>
         <w:t xml:space="preserve">G</w:t>
       </w:r>
-      <w:bookmarkStart w:name="sec_2_1" w:id="1"/>
+      <w:bookmarkStart w:name="sec_2_1" w:id="5"/>
       <w:r>
         <w:rPr>
           <w:b w:val="false"/>
@@ -2576,7 +2576,7 @@
         </w:rPr>
         <w:t xml:space="preserve">overnance and decision rights</w:t>
       </w:r>
-      <w:bookmarkEnd w:id="1"/>
+      <w:bookmarkEnd w:id="5"/>
     </w:p>
     <w:tbl>
       <w:tblPr>
@@ -3282,7 +3282,7 @@
       <w:r>
         <w:t xml:space="preserve">S</w:t>
       </w:r>
-      <w:bookmarkStart w:name="sec_2_2" w:id="1"/>
+      <w:bookmarkStart w:name="sec_2_2" w:id="6"/>
       <w:r>
         <w:rPr>
           <w:b w:val="false"/>
@@ -3292,7 +3292,7 @@
         </w:rPr>
         <w:t xml:space="preserve">ecurity policies</w:t>
       </w:r>
-      <w:bookmarkEnd w:id="1"/>
+      <w:bookmarkEnd w:id="6"/>
     </w:p>
     <w:p>
       <w:pPr>
@@ -4075,7 +4075,7 @@
       <w:r>
         <w:t xml:space="preserve">A</w:t>
       </w:r>
-      <w:bookmarkStart w:name="sec_3" w:id="1"/>
+      <w:bookmarkStart w:name="sec_3" w:id="7"/>
       <w:r>
         <w:rPr>
           <w:b w:val="false"/>
@@ -4085,7 +4085,7 @@
         </w:rPr>
         <w:t xml:space="preserve">rchitecture and Framework Compliance</w:t>
       </w:r>
-      <w:bookmarkEnd w:id="1"/>
+      <w:bookmarkEnd w:id="7"/>
     </w:p>
     <w:p>
       <w:pPr>
@@ -4099,7 +4099,7 @@
       <w:r>
         <w:t xml:space="preserve">C</w:t>
       </w:r>
-      <w:bookmarkStart w:name="sec_3_1" w:id="1"/>
+      <w:bookmarkStart w:name="sec_3_1" w:id="8"/>
       <w:r>
         <w:rPr>
           <w:b w:val="false"/>
@@ -4109,7 +4109,7 @@
         </w:rPr>
         <w:t xml:space="preserve">ybersecurity architecture</w:t>
       </w:r>
-      <w:bookmarkEnd w:id="1"/>
+      <w:bookmarkEnd w:id="8"/>
     </w:p>
     <w:p>
       <w:pPr>
@@ -4234,7 +4234,7 @@
       <w:r>
         <w:t xml:space="preserve">F</w:t>
       </w:r>
-      <w:bookmarkStart w:name="sec_3_2" w:id="1"/>
+      <w:bookmarkStart w:name="sec_3_2" w:id="9"/>
       <w:r>
         <w:rPr>
           <w:b w:val="false"/>
@@ -4244,7 +4244,7 @@
         </w:rPr>
         <w:t xml:space="preserve">ramework compliance matrix</w:t>
       </w:r>
-      <w:bookmarkEnd w:id="1"/>
+      <w:bookmarkEnd w:id="9"/>
     </w:p>
     <w:tbl>
       <w:tblPr>
@@ -6330,7 +6330,7 @@
       <w:r>
         <w:t xml:space="preserve">R</w:t>
       </w:r>
-      <w:bookmarkStart w:name="sec_4" w:id="1"/>
+      <w:bookmarkStart w:name="sec_4" w:id="10"/>
       <w:r>
         <w:rPr>
           <w:b w:val="false"/>
@@ -6340,7 +6340,7 @@
         </w:rPr>
         <w:t xml:space="preserve">isk Assessment</w:t>
       </w:r>
-      <w:bookmarkEnd w:id="1"/>
+      <w:bookmarkEnd w:id="10"/>
     </w:p>
     <w:p>
       <w:pPr>
@@ -6354,7 +6354,7 @@
       <w:r>
         <w:t xml:space="preserve">M</w:t>
       </w:r>
-      <w:bookmarkStart w:name="sec_4_1" w:id="1"/>
+      <w:bookmarkStart w:name="sec_4_1" w:id="11"/>
       <w:r>
         <w:rPr>
           <w:b w:val="false"/>
@@ -6364,7 +6364,7 @@
         </w:rPr>
         <w:t xml:space="preserve">ethod</w:t>
       </w:r>
-      <w:bookmarkEnd w:id="1"/>
+      <w:bookmarkEnd w:id="11"/>
     </w:p>
     <w:p>
       <w:pPr>
@@ -6661,7 +6661,7 @@
       <w:r>
         <w:t xml:space="preserve">R</w:t>
       </w:r>
-      <w:bookmarkStart w:name="sec_4_2" w:id="1"/>
+      <w:bookmarkStart w:name="sec_4_2" w:id="12"/>
       <w:r>
         <w:rPr>
           <w:b w:val="false"/>
@@ -6671,7 +6671,7 @@
         </w:rPr>
         <w:t xml:space="preserve">isk criteria and assessment matrix</w:t>
       </w:r>
-      <w:bookmarkEnd w:id="1"/>
+      <w:bookmarkEnd w:id="12"/>
     </w:p>
     <w:tbl>
       <w:tblPr>
@@ -8399,7 +8399,7 @@
       <w:r>
         <w:t xml:space="preserve">R</w:t>
       </w:r>
-      <w:bookmarkStart w:name="sec_4_3" w:id="1"/>
+      <w:bookmarkStart w:name="sec_4_3" w:id="13"/>
       <w:r>
         <w:rPr>
           <w:b w:val="false"/>
@@ -8409,7 +8409,7 @@
         </w:rPr>
         <w:t xml:space="preserve">isk identification register</w:t>
       </w:r>
-      <w:bookmarkEnd w:id="1"/>
+      <w:bookmarkEnd w:id="13"/>
     </w:p>
     <w:p>
       <w:pPr>
@@ -10258,7 +10258,7 @@
       <w:r>
         <w:t xml:space="preserve">R</w:t>
       </w:r>
-      <w:bookmarkStart w:name="sec_4_4" w:id="1"/>
+      <w:bookmarkStart w:name="sec_4_4" w:id="14"/>
       <w:r>
         <w:rPr>
           <w:b w:val="false"/>
@@ -10268,7 +10268,7 @@
         </w:rPr>
         <w:t xml:space="preserve">isk position before and after treatment</w:t>
       </w:r>
-      <w:bookmarkEnd w:id="1"/>
+      <w:bookmarkEnd w:id="14"/>
     </w:p>
     <w:p>
       <w:pPr>
@@ -11611,7 +11611,7 @@
       <w:r>
         <w:t xml:space="preserve">M</w:t>
       </w:r>
-      <w:bookmarkStart w:name="sec_5" w:id="1"/>
+      <w:bookmarkStart w:name="sec_5" w:id="15"/>
       <w:r>
         <w:rPr>
           <w:b w:val="false"/>
@@ -11621,7 +11621,7 @@
         </w:rPr>
         <w:t xml:space="preserve">itigation and Control Strategy</w:t>
       </w:r>
-      <w:bookmarkEnd w:id="1"/>
+      <w:bookmarkEnd w:id="15"/>
     </w:p>
     <w:p>
       <w:pPr>
@@ -11635,7 +11635,7 @@
       <w:r>
         <w:t xml:space="preserve">C</w:t>
       </w:r>
-      <w:bookmarkStart w:name="sec_5_1" w:id="1"/>
+      <w:bookmarkStart w:name="sec_5_1" w:id="16"/>
       <w:r>
         <w:rPr>
           <w:b w:val="false"/>
@@ -11645,7 +11645,7 @@
         </w:rPr>
         <w:t xml:space="preserve">ontrol strategy</w:t>
       </w:r>
-      <w:bookmarkEnd w:id="1"/>
+      <w:bookmarkEnd w:id="16"/>
     </w:p>
     <w:tbl>
       <w:tblPr>
@@ -11974,7 +11974,7 @@
       <w:r>
         <w:t xml:space="preserve">C</w:t>
       </w:r>
-      <w:bookmarkStart w:name="sec_5_2" w:id="1"/>
+      <w:bookmarkStart w:name="sec_5_2" w:id="17"/>
       <w:r>
         <w:rPr>
           <w:b w:val="false"/>
@@ -11984,7 +11984,7 @@
         </w:rPr>
         <w:t xml:space="preserve">ontrols by risk</w:t>
       </w:r>
-      <w:bookmarkEnd w:id="1"/>
+      <w:bookmarkEnd w:id="17"/>
     </w:p>
     <w:tbl>
       <w:tblPr>
@@ -12857,7 +12857,7 @@
       <w:r>
         <w:t xml:space="preserve">M</w:t>
       </w:r>
-      <w:bookmarkStart w:name="sec_5_3" w:id="1"/>
+      <w:bookmarkStart w:name="sec_5_3" w:id="18"/>
       <w:r>
         <w:rPr>
           <w:b w:val="false"/>
@@ -12867,7 +12867,7 @@
         </w:rPr>
         <w:t xml:space="preserve">itigation and control strategy template</w:t>
       </w:r>
-      <w:bookmarkEnd w:id="1"/>
+      <w:bookmarkEnd w:id="18"/>
     </w:p>
     <w:p>
       <w:pPr>
@@ -13645,7 +13645,7 @@
       <w:r>
         <w:t xml:space="preserve">I</w:t>
       </w:r>
-      <w:bookmarkStart w:name="sec_6" w:id="1"/>
+      <w:bookmarkStart w:name="sec_6" w:id="19"/>
       <w:r>
         <w:rPr>
           <w:b w:val="false"/>
@@ -13655,7 +13655,7 @@
         </w:rPr>
         <w:t xml:space="preserve">mplementation Method Statement</w:t>
       </w:r>
-      <w:bookmarkEnd w:id="1"/>
+      <w:bookmarkEnd w:id="19"/>
     </w:p>
     <w:p>
       <w:pPr>
@@ -13669,7 +13669,7 @@
       <w:r>
         <w:t xml:space="preserve">S</w:t>
       </w:r>
-      <w:bookmarkStart w:name="sec_6_1" w:id="1"/>
+      <w:bookmarkStart w:name="sec_6_1" w:id="20"/>
       <w:r>
         <w:rPr>
           <w:b w:val="false"/>
@@ -13679,7 +13679,7 @@
         </w:rPr>
         <w:t xml:space="preserve">ecurity activities by phase</w:t>
       </w:r>
-      <w:bookmarkEnd w:id="1"/>
+      <w:bookmarkEnd w:id="20"/>
     </w:p>
     <w:p>
       <w:pPr>
@@ -14447,7 +14447,7 @@
       <w:r>
         <w:t xml:space="preserve">S</w:t>
       </w:r>
-      <w:bookmarkStart w:name="sec_6_2" w:id="1"/>
+      <w:bookmarkStart w:name="sec_6_2" w:id="21"/>
       <w:r>
         <w:rPr>
           <w:b w:val="false"/>
@@ -14457,7 +14457,7 @@
         </w:rPr>
         <w:t xml:space="preserve">ecurity testing</w:t>
       </w:r>
-      <w:bookmarkEnd w:id="1"/>
+      <w:bookmarkEnd w:id="21"/>
     </w:p>
     <w:tbl>
       <w:tblPr>
@@ -14928,7 +14928,7 @@
       <w:r>
         <w:t xml:space="preserve">H</w:t>
       </w:r>
-      <w:bookmarkStart w:name="sec_6_3" w:id="1"/>
+      <w:bookmarkStart w:name="sec_6_3" w:id="22"/>
       <w:r>
         <w:rPr>
           <w:b w:val="false"/>
@@ -14938,7 +14938,7 @@
         </w:rPr>
         <w:t xml:space="preserve">andover and operation</w:t>
       </w:r>
-      <w:bookmarkEnd w:id="1"/>
+      <w:bookmarkEnd w:id="22"/>
     </w:p>
     <w:p>
       <w:pPr>
@@ -15120,7 +15120,7 @@
       <w:r>
         <w:t xml:space="preserve">I</w:t>
       </w:r>
-      <w:bookmarkStart w:name="sec_7" w:id="1"/>
+      <w:bookmarkStart w:name="sec_7" w:id="23"/>
       <w:r>
         <w:rPr>
           <w:b w:val="false"/>
@@ -15130,7 +15130,7 @@
         </w:rPr>
         <w:t xml:space="preserve">ncident Response Plan</w:t>
       </w:r>
-      <w:bookmarkEnd w:id="1"/>
+      <w:bookmarkEnd w:id="23"/>
     </w:p>
     <w:p>
       <w:pPr>
@@ -15144,7 +15144,7 @@
       <w:r>
         <w:t xml:space="preserve">T</w:t>
       </w:r>
-      <w:bookmarkStart w:name="sec_7_1" w:id="1"/>
+      <w:bookmarkStart w:name="sec_7_1" w:id="24"/>
       <w:r>
         <w:rPr>
           <w:b w:val="false"/>
@@ -15154,7 +15154,7 @@
         </w:rPr>
         <w:t xml:space="preserve">eam and escalation matrix</w:t>
       </w:r>
-      <w:bookmarkEnd w:id="1"/>
+      <w:bookmarkEnd w:id="24"/>
     </w:p>
     <w:p>
       <w:pPr>
@@ -16119,7 +16119,7 @@
       <w:r>
         <w:t xml:space="preserve">R</w:t>
       </w:r>
-      <w:bookmarkStart w:name="sec_7_2" w:id="1"/>
+      <w:bookmarkStart w:name="sec_7_2" w:id="25"/>
       <w:r>
         <w:rPr>
           <w:b w:val="false"/>
@@ -16129,7 +16129,7 @@
         </w:rPr>
         <w:t xml:space="preserve">esponse process</w:t>
       </w:r>
-      <w:bookmarkEnd w:id="1"/>
+      <w:bookmarkEnd w:id="25"/>
     </w:p>
     <w:tbl>
       <w:tblPr>
@@ -16613,7 +16613,7 @@
       <w:r>
         <w:t xml:space="preserve">C</w:t>
       </w:r>
-      <w:bookmarkStart w:name="sec_7_3" w:id="1"/>
+      <w:bookmarkStart w:name="sec_7_3" w:id="26"/>
       <w:r>
         <w:rPr>
           <w:b w:val="false"/>
@@ -16623,7 +16623,7 @@
         </w:rPr>
         <w:t xml:space="preserve">ontractual incident categories</w:t>
       </w:r>
-      <w:bookmarkEnd w:id="1"/>
+      <w:bookmarkEnd w:id="26"/>
     </w:p>
     <w:p>
       <w:pPr>
@@ -17527,7 +17527,7 @@
       <w:r>
         <w:t xml:space="preserve">N</w:t>
       </w:r>
-      <w:bookmarkStart w:name="sec_7_4" w:id="1"/>
+      <w:bookmarkStart w:name="sec_7_4" w:id="27"/>
       <w:r>
         <w:rPr>
           <w:b w:val="false"/>
@@ -17537,7 +17537,7 @@
         </w:rPr>
         <w:t xml:space="preserve">otification and reporting</w:t>
       </w:r>
-      <w:bookmarkEnd w:id="1"/>
+      <w:bookmarkEnd w:id="27"/>
     </w:p>
     <w:tbl>
       <w:tblPr>
@@ -17903,7 +17903,7 @@
       <w:r>
         <w:t xml:space="preserve">B</w:t>
       </w:r>
-      <w:bookmarkStart w:name="sec_8" w:id="1"/>
+      <w:bookmarkStart w:name="sec_8" w:id="28"/>
       <w:r>
         <w:rPr>
           <w:b w:val="false"/>
@@ -17913,7 +17913,7 @@
         </w:rPr>
         <w:t xml:space="preserve">usiness Continuity Response Plan</w:t>
       </w:r>
-      <w:bookmarkEnd w:id="1"/>
+      <w:bookmarkEnd w:id="28"/>
     </w:p>
     <w:p>
       <w:pPr>
@@ -17927,7 +17927,7 @@
       <w:r>
         <w:t xml:space="preserve">R</w:t>
       </w:r>
-      <w:bookmarkStart w:name="sec_8_1" w:id="1"/>
+      <w:bookmarkStart w:name="sec_8_1" w:id="29"/>
       <w:r>
         <w:rPr>
           <w:b w:val="false"/>
@@ -17937,7 +17937,7 @@
         </w:rPr>
         <w:t xml:space="preserve">ecovery targets and scenarios</w:t>
       </w:r>
-      <w:bookmarkEnd w:id="1"/>
+      <w:bookmarkEnd w:id="29"/>
     </w:p>
     <w:p>
       <w:pPr>
@@ -18449,7 +18449,7 @@
       <w:r>
         <w:t xml:space="preserve">A</w:t>
       </w:r>
-      <w:bookmarkStart w:name="sec_8_2" w:id="1"/>
+      <w:bookmarkStart w:name="sec_8_2" w:id="30"/>
       <w:r>
         <w:rPr>
           <w:b w:val="false"/>
@@ -18459,7 +18459,7 @@
         </w:rPr>
         <w:t xml:space="preserve">ctivation, communication and testing</w:t>
       </w:r>
-      <w:bookmarkEnd w:id="1"/>
+      <w:bookmarkEnd w:id="30"/>
     </w:p>
     <w:p>
       <w:pPr>
@@ -18614,7 +18614,7 @@
       <w:r>
         <w:t xml:space="preserve">R</w:t>
       </w:r>
-      <w:bookmarkStart w:name="sec_9" w:id="1"/>
+      <w:bookmarkStart w:name="sec_9" w:id="31"/>
       <w:r>
         <w:rPr>
           <w:b w:val="false"/>
@@ -18624,7 +18624,7 @@
         </w:rPr>
         <w:t xml:space="preserve">esources, Schedule and Capacity Building</w:t>
       </w:r>
-      <w:bookmarkEnd w:id="1"/>
+      <w:bookmarkEnd w:id="31"/>
     </w:p>
     <w:p>
       <w:pPr>
@@ -18638,7 +18638,7 @@
       <w:r>
         <w:t xml:space="preserve">C</w:t>
       </w:r>
-      <w:bookmarkStart w:name="sec_9_1" w:id="1"/>
+      <w:bookmarkStart w:name="sec_9_1" w:id="32"/>
       <w:r>
         <w:rPr>
           <w:b w:val="false"/>
@@ -18648,7 +18648,7 @@
         </w:rPr>
         <w:t xml:space="preserve">ybersecurity work breakdown structure</w:t>
       </w:r>
-      <w:bookmarkEnd w:id="1"/>
+      <w:bookmarkEnd w:id="32"/>
     </w:p>
     <w:tbl>
       <w:tblPr>
@@ -19461,7 +19461,7 @@
       <w:r>
         <w:t xml:space="preserve">T</w:t>
       </w:r>
-      <w:bookmarkStart w:name="sec_9_2" w:id="1"/>
+      <w:bookmarkStart w:name="sec_9_2" w:id="33"/>
       <w:r>
         <w:rPr>
           <w:b w:val="false"/>
@@ -19471,7 +19471,7 @@
         </w:rPr>
         <w:t xml:space="preserve">imeline</w:t>
       </w:r>
-      <w:bookmarkEnd w:id="1"/>
+      <w:bookmarkEnd w:id="33"/>
     </w:p>
     <w:p>
       <w:pPr>
@@ -19564,7 +19564,7 @@
       <w:r>
         <w:t xml:space="preserve">R</w:t>
       </w:r>
-      <w:bookmarkStart w:name="sec_9_3" w:id="1"/>
+      <w:bookmarkStart w:name="sec_9_3" w:id="34"/>
       <w:r>
         <w:rPr>
           <w:b w:val="false"/>
@@ -19574,7 +19574,7 @@
         </w:rPr>
         <w:t xml:space="preserve">esource and skill matrix</w:t>
       </w:r>
-      <w:bookmarkEnd w:id="1"/>
+      <w:bookmarkEnd w:id="34"/>
     </w:p>
     <w:tbl>
       <w:tblPr>
@@ -20892,7 +20892,7 @@
       <w:r>
         <w:t xml:space="preserve">C</w:t>
       </w:r>
-      <w:bookmarkStart w:name="sec_9_4" w:id="1"/>
+      <w:bookmarkStart w:name="sec_9_4" w:id="35"/>
       <w:r>
         <w:rPr>
           <w:b w:val="false"/>
@@ -20902,7 +20902,7 @@
         </w:rPr>
         <w:t xml:space="preserve">apacity building and knowledge transfer</w:t>
       </w:r>
-      <w:bookmarkEnd w:id="1"/>
+      <w:bookmarkEnd w:id="35"/>
     </w:p>
     <w:p>
       <w:pPr>
@@ -21334,7 +21334,7 @@
       <w:r>
         <w:t xml:space="preserve">I</w:t>
       </w:r>
-      <w:bookmarkStart w:name="sec_10" w:id="1"/>
+      <w:bookmarkStart w:name="sec_10" w:id="36"/>
       <w:r>
         <w:rPr>
           <w:b w:val="false"/>
@@ -21344,7 +21344,7 @@
         </w:rPr>
         <w:t xml:space="preserve">nnovations</w:t>
       </w:r>
-      <w:bookmarkEnd w:id="1"/>
+      <w:bookmarkEnd w:id="36"/>
     </w:p>
     <w:tbl>
       <w:tblPr>
@@ -21745,7 +21745,7 @@
       <w:r>
         <w:t xml:space="preserve">C</w:t>
       </w:r>
-      <w:bookmarkStart w:name="sec_11" w:id="1"/>
+      <w:bookmarkStart w:name="sec_11" w:id="37"/>
       <w:r>
         <w:rPr>
           <w:b w:val="false"/>
@@ -21755,7 +21755,7 @@
         </w:rPr>
         <w:t xml:space="preserve">ompliance</w:t>
       </w:r>
-      <w:bookmarkEnd w:id="1"/>
+      <w:bookmarkEnd w:id="37"/>
     </w:p>
     <w:p>
       <w:pPr>
@@ -21769,7 +21769,7 @@
       <w:r>
         <w:t xml:space="preserve">C</w:t>
       </w:r>
-      <w:bookmarkStart w:name="sec_11_1" w:id="1"/>
+      <w:bookmarkStart w:name="sec_11_1" w:id="38"/>
       <w:r>
         <w:rPr>
           <w:b w:val="false"/>
@@ -21779,7 +21779,7 @@
         </w:rPr>
         <w:t xml:space="preserve">ompliance and governance statement</w:t>
       </w:r>
-      <w:bookmarkEnd w:id="1"/>
+      <w:bookmarkEnd w:id="38"/>
     </w:p>
     <w:p>
       <w:pPr>
@@ -22023,7 +22023,7 @@
       <w:r>
         <w:t xml:space="preserve">R</w:t>
       </w:r>
-      <w:bookmarkStart w:name="sec_11_2" w:id="1"/>
+      <w:bookmarkStart w:name="sec_11_2" w:id="39"/>
       <w:r>
         <w:rPr>
           <w:b w:val="false"/>
@@ -22033,7 +22033,7 @@
         </w:rPr>
         <w:t xml:space="preserve">equirements compliance matrix</w:t>
       </w:r>
-      <w:bookmarkEnd w:id="1"/>
+      <w:bookmarkEnd w:id="39"/>
     </w:p>
     <w:tbl>
       <w:tblPr>

</xml_diff>

<commit_message>
Write section references as links, not REF fields
Even with unique bookmark ids, updating the fields in Word still turned
the internal "Section N.N" references into "Error! Reference source not
found", while LibreOffice resolved every one of them after a forced
recompute. Rather than depend on Word evaluating the fields, each
reference is now the section number as text, linked to the heading's
bookmark, so it stays clickable and has nothing for Word to recompute.

The number is still checked against the headings at every build, so it
is correct when the document is produced. It no longer renumbers by
itself if a heading is added in Word.

The System Architecture (208 references), Project Plan (23) and
Cybersecurity Plan (48) are rebuilt. Every reference links to the same
heading as before, and the visible text is unchanged in all four
documents.

Co-Authored-By: Claude Opus 5.5 <noreply@anthropic.com>
Claude-Session: https://claude.ai/code/session_01G5KtDfxnVyqdZUVCaXFbWe
</commit_message>
<xml_diff>
--- a/Cybersecurity-Risk-Management-Plan.docx
+++ b/Cybersecurity-Risk-Management-Plan.docx
@@ -1053,11 +1053,17 @@
               </w:rPr>
               <w:t xml:space="preserve">Sections </w:t>
             </w:r>
-            <w:fldSimple w:instr="REF sec_1_2 \w \h">
+            <w:hyperlink w:history="1" w:anchor="sec_1_2">
               <w:r>
+                <w:rPr>
+                  <w:b w:val="false"/>
+                  <w:bCs w:val="false"/>
+                  <w:i w:val="false"/>
+                  <w:iCs w:val="false"/>
+                </w:rPr>
                 <w:t xml:space="preserve">1.2</w:t>
               </w:r>
-            </w:fldSimple>
+            </w:hyperlink>
             <w:r>
               <w:rPr>
                 <w:b w:val="false"/>
@@ -1144,11 +1150,17 @@
               </w:rPr>
               <w:t xml:space="preserve">Section </w:t>
             </w:r>
-            <w:fldSimple w:instr="REF sec_3_2 \w \h">
+            <w:hyperlink w:history="1" w:anchor="sec_3_2">
               <w:r>
+                <w:rPr>
+                  <w:b w:val="false"/>
+                  <w:bCs w:val="false"/>
+                  <w:i w:val="false"/>
+                  <w:iCs w:val="false"/>
+                </w:rPr>
                 <w:t xml:space="preserve">3.2</w:t>
               </w:r>
-            </w:fldSimple>
+            </w:hyperlink>
           </w:p>
         </w:tc>
       </w:tr>
@@ -1226,11 +1238,17 @@
               </w:rPr>
               <w:t xml:space="preserve">Section </w:t>
             </w:r>
-            <w:fldSimple w:instr="REF sec_3_1 \w \h">
+            <w:hyperlink w:history="1" w:anchor="sec_3_1">
               <w:r>
+                <w:rPr>
+                  <w:b w:val="false"/>
+                  <w:bCs w:val="false"/>
+                  <w:i w:val="false"/>
+                  <w:iCs w:val="false"/>
+                </w:rPr>
                 <w:t xml:space="preserve">3.1</w:t>
               </w:r>
-            </w:fldSimple>
+            </w:hyperlink>
           </w:p>
         </w:tc>
       </w:tr>
@@ -1308,11 +1326,17 @@
               </w:rPr>
               <w:t xml:space="preserve">Section </w:t>
             </w:r>
-            <w:fldSimple w:instr="REF sec_4_3 \w \h">
+            <w:hyperlink w:history="1" w:anchor="sec_4_3">
               <w:r>
+                <w:rPr>
+                  <w:b w:val="false"/>
+                  <w:bCs w:val="false"/>
+                  <w:i w:val="false"/>
+                  <w:iCs w:val="false"/>
+                </w:rPr>
                 <w:t xml:space="preserve">4.3</w:t>
               </w:r>
-            </w:fldSimple>
+            </w:hyperlink>
           </w:p>
         </w:tc>
       </w:tr>
@@ -1390,11 +1414,17 @@
               </w:rPr>
               <w:t xml:space="preserve">Sections </w:t>
             </w:r>
-            <w:fldSimple w:instr="REF sec_4_2 \w \h">
+            <w:hyperlink w:history="1" w:anchor="sec_4_2">
               <w:r>
+                <w:rPr>
+                  <w:b w:val="false"/>
+                  <w:bCs w:val="false"/>
+                  <w:i w:val="false"/>
+                  <w:iCs w:val="false"/>
+                </w:rPr>
                 <w:t xml:space="preserve">4.2</w:t>
               </w:r>
-            </w:fldSimple>
+            </w:hyperlink>
             <w:r>
               <w:rPr>
                 <w:b w:val="false"/>
@@ -1404,11 +1434,17 @@
               </w:rPr>
               <w:t xml:space="preserve"> and </w:t>
             </w:r>
-            <w:fldSimple w:instr="REF sec_4_4 \w \h">
+            <w:hyperlink w:history="1" w:anchor="sec_4_4">
               <w:r>
+                <w:rPr>
+                  <w:b w:val="false"/>
+                  <w:bCs w:val="false"/>
+                  <w:i w:val="false"/>
+                  <w:iCs w:val="false"/>
+                </w:rPr>
                 <w:t xml:space="preserve">4.4</w:t>
               </w:r>
-            </w:fldSimple>
+            </w:hyperlink>
           </w:p>
         </w:tc>
       </w:tr>
@@ -1717,11 +1753,17 @@
               </w:rPr>
               <w:t xml:space="preserve">Sections 2 and </w:t>
             </w:r>
-            <w:fldSimple w:instr="REF sec_11_1 \w \h">
+            <w:hyperlink w:history="1" w:anchor="sec_11_1">
               <w:r>
+                <w:rPr>
+                  <w:b w:val="false"/>
+                  <w:bCs w:val="false"/>
+                  <w:i w:val="false"/>
+                  <w:iCs w:val="false"/>
+                </w:rPr>
                 <w:t xml:space="preserve">11.1</w:t>
               </w:r>
-            </w:fldSimple>
+            </w:hyperlink>
           </w:p>
         </w:tc>
       </w:tr>
@@ -1799,11 +1841,17 @@
               </w:rPr>
               <w:t xml:space="preserve">Section </w:t>
             </w:r>
-            <w:fldSimple w:instr="REF sec_9_1 \w \h">
+            <w:hyperlink w:history="1" w:anchor="sec_9_1">
               <w:r>
+                <w:rPr>
+                  <w:b w:val="false"/>
+                  <w:bCs w:val="false"/>
+                  <w:i w:val="false"/>
+                  <w:iCs w:val="false"/>
+                </w:rPr>
                 <w:t xml:space="preserve">9.1</w:t>
               </w:r>
-            </w:fldSimple>
+            </w:hyperlink>
           </w:p>
         </w:tc>
       </w:tr>
@@ -1881,11 +1929,17 @@
               </w:rPr>
               <w:t xml:space="preserve">Section </w:t>
             </w:r>
-            <w:fldSimple w:instr="REF sec_9_3 \w \h">
+            <w:hyperlink w:history="1" w:anchor="sec_9_3">
               <w:r>
+                <w:rPr>
+                  <w:b w:val="false"/>
+                  <w:bCs w:val="false"/>
+                  <w:i w:val="false"/>
+                  <w:iCs w:val="false"/>
+                </w:rPr>
                 <w:t xml:space="preserve">9.3</w:t>
               </w:r>
-            </w:fldSimple>
+            </w:hyperlink>
           </w:p>
         </w:tc>
       </w:tr>
@@ -1963,11 +2017,17 @@
               </w:rPr>
               <w:t xml:space="preserve">Section </w:t>
             </w:r>
-            <w:fldSimple w:instr="REF sec_9_4 \w \h">
+            <w:hyperlink w:history="1" w:anchor="sec_9_4">
               <w:r>
+                <w:rPr>
+                  <w:b w:val="false"/>
+                  <w:bCs w:val="false"/>
+                  <w:i w:val="false"/>
+                  <w:iCs w:val="false"/>
+                </w:rPr>
                 <w:t xml:space="preserve">9.4</w:t>
               </w:r>
-            </w:fldSimple>
+            </w:hyperlink>
           </w:p>
         </w:tc>
       </w:tr>
@@ -2045,11 +2105,17 @@
               </w:rPr>
               <w:t xml:space="preserve">Section </w:t>
             </w:r>
-            <w:fldSimple w:instr="REF sec_9_2 \w \h">
+            <w:hyperlink w:history="1" w:anchor="sec_9_2">
               <w:r>
+                <w:rPr>
+                  <w:b w:val="false"/>
+                  <w:bCs w:val="false"/>
+                  <w:i w:val="false"/>
+                  <w:iCs w:val="false"/>
+                </w:rPr>
                 <w:t xml:space="preserve">9.2</w:t>
               </w:r>
-            </w:fldSimple>
+            </w:hyperlink>
           </w:p>
         </w:tc>
       </w:tr>
@@ -2127,11 +2193,17 @@
               </w:rPr>
               <w:t xml:space="preserve">Section </w:t>
             </w:r>
-            <w:fldSimple w:instr="REF sec_11_2 \w \h">
+            <w:hyperlink w:history="1" w:anchor="sec_11_2">
               <w:r>
+                <w:rPr>
+                  <w:b w:val="false"/>
+                  <w:bCs w:val="false"/>
+                  <w:i w:val="false"/>
+                  <w:iCs w:val="false"/>
+                </w:rPr>
                 <w:t xml:space="preserve">11.2</w:t>
               </w:r>
-            </w:fldSimple>
+            </w:hyperlink>
           </w:p>
         </w:tc>
       </w:tr>
@@ -2427,11 +2499,17 @@
         </w:rPr>
         <w:t xml:space="preserve">Section </w:t>
       </w:r>
-      <w:fldSimple w:instr="REF sec_3_2 \w \h">
+      <w:hyperlink w:history="1" w:anchor="sec_3_2">
         <w:r>
+          <w:rPr>
+            <w:b w:val="false"/>
+            <w:bCs w:val="false"/>
+            <w:i w:val="false"/>
+            <w:iCs w:val="false"/>
+          </w:rPr>
           <w:t xml:space="preserve">3.2</w:t>
         </w:r>
-      </w:fldSimple>
+      </w:hyperlink>
       <w:r>
         <w:rPr>
           <w:b w:val="false"/>
@@ -4404,11 +4482,17 @@
               </w:rPr>
               <w:t xml:space="preserve">Section </w:t>
             </w:r>
-            <w:fldSimple w:instr="REF sec_4_2 \w \h">
+            <w:hyperlink w:history="1" w:anchor="sec_4_2">
               <w:r>
+                <w:rPr>
+                  <w:b w:val="false"/>
+                  <w:bCs w:val="false"/>
+                  <w:i w:val="false"/>
+                  <w:iCs w:val="false"/>
+                </w:rPr>
                 <w:t xml:space="preserve">4.2</w:t>
               </w:r>
-            </w:fldSimple>
+            </w:hyperlink>
           </w:p>
         </w:tc>
         <w:tc>
@@ -4581,11 +4665,17 @@
               </w:rPr>
               <w:t xml:space="preserve">Section </w:t>
             </w:r>
-            <w:fldSimple w:instr="REF sec_2_1 \w \h">
+            <w:hyperlink w:history="1" w:anchor="sec_2_1">
               <w:r>
+                <w:rPr>
+                  <w:b w:val="false"/>
+                  <w:bCs w:val="false"/>
+                  <w:i w:val="false"/>
+                  <w:iCs w:val="false"/>
+                </w:rPr>
                 <w:t xml:space="preserve">2.1</w:t>
               </w:r>
-            </w:fldSimple>
+            </w:hyperlink>
             <w:r>
               <w:rPr>
                 <w:b w:val="false"/>
@@ -4604,11 +4694,17 @@
               </w:rPr>
               <w:t xml:space="preserve">Section </w:t>
             </w:r>
-            <w:fldSimple w:instr="REF sec_9_3 \w \h">
+            <w:hyperlink w:history="1" w:anchor="sec_9_3">
               <w:r>
+                <w:rPr>
+                  <w:b w:val="false"/>
+                  <w:bCs w:val="false"/>
+                  <w:i w:val="false"/>
+                  <w:iCs w:val="false"/>
+                </w:rPr>
                 <w:t xml:space="preserve">9.3</w:t>
               </w:r>
-            </w:fldSimple>
+            </w:hyperlink>
           </w:p>
         </w:tc>
         <w:tc>
@@ -4695,11 +4791,17 @@
               </w:rPr>
               <w:t xml:space="preserve">Section </w:t>
             </w:r>
-            <w:fldSimple w:instr="REF sec_2_2 \w \h">
+            <w:hyperlink w:history="1" w:anchor="sec_2_2">
               <w:r>
+                <w:rPr>
+                  <w:b w:val="false"/>
+                  <w:bCs w:val="false"/>
+                  <w:i w:val="false"/>
+                  <w:iCs w:val="false"/>
+                </w:rPr>
                 <w:t xml:space="preserve">2.2</w:t>
               </w:r>
-            </w:fldSimple>
+            </w:hyperlink>
           </w:p>
         </w:tc>
         <w:tc>
@@ -4786,11 +4888,17 @@
               </w:rPr>
               <w:t xml:space="preserve">Section </w:t>
             </w:r>
-            <w:fldSimple w:instr="REF sec_6_3 \w \h">
+            <w:hyperlink w:history="1" w:anchor="sec_6_3">
               <w:r>
+                <w:rPr>
+                  <w:b w:val="false"/>
+                  <w:bCs w:val="false"/>
+                  <w:i w:val="false"/>
+                  <w:iCs w:val="false"/>
+                </w:rPr>
                 <w:t xml:space="preserve">6.3</w:t>
               </w:r>
-            </w:fldSimple>
+            </w:hyperlink>
           </w:p>
         </w:tc>
         <w:tc>
@@ -4877,11 +4985,17 @@
               </w:rPr>
               <w:t xml:space="preserve">Section </w:t>
             </w:r>
-            <w:fldSimple w:instr="REF sec_6_1 \w \h">
+            <w:hyperlink w:history="1" w:anchor="sec_6_1">
               <w:r>
+                <w:rPr>
+                  <w:b w:val="false"/>
+                  <w:bCs w:val="false"/>
+                  <w:i w:val="false"/>
+                  <w:iCs w:val="false"/>
+                </w:rPr>
                 <w:t xml:space="preserve">6.1</w:t>
               </w:r>
-            </w:fldSimple>
+            </w:hyperlink>
           </w:p>
         </w:tc>
         <w:tc>
@@ -5054,11 +5168,17 @@
               </w:rPr>
               <w:t xml:space="preserve">Sections 4 and </w:t>
             </w:r>
-            <w:fldSimple w:instr="REF sec_6_1 \w \h">
+            <w:hyperlink w:history="1" w:anchor="sec_6_1">
               <w:r>
+                <w:rPr>
+                  <w:b w:val="false"/>
+                  <w:bCs w:val="false"/>
+                  <w:i w:val="false"/>
+                  <w:iCs w:val="false"/>
+                </w:rPr>
                 <w:t xml:space="preserve">6.1</w:t>
               </w:r>
-            </w:fldSimple>
+            </w:hyperlink>
           </w:p>
         </w:tc>
         <w:tc>
@@ -5308,11 +5428,17 @@
               </w:rPr>
               <w:t xml:space="preserve">Section </w:t>
             </w:r>
-            <w:fldSimple w:instr="REF sec_9_4 \w \h">
+            <w:hyperlink w:history="1" w:anchor="sec_9_4">
               <w:r>
+                <w:rPr>
+                  <w:b w:val="false"/>
+                  <w:bCs w:val="false"/>
+                  <w:i w:val="false"/>
+                  <w:iCs w:val="false"/>
+                </w:rPr>
                 <w:t xml:space="preserve">9.4</w:t>
               </w:r>
-            </w:fldSimple>
+            </w:hyperlink>
           </w:p>
         </w:tc>
         <w:tc>
@@ -5743,11 +5869,17 @@
               </w:rPr>
               <w:t xml:space="preserve">Sections </w:t>
             </w:r>
-            <w:fldSimple w:instr="REF sec_7_2 \w \h">
+            <w:hyperlink w:history="1" w:anchor="sec_7_2">
               <w:r>
+                <w:rPr>
+                  <w:b w:val="false"/>
+                  <w:bCs w:val="false"/>
+                  <w:i w:val="false"/>
+                  <w:iCs w:val="false"/>
+                </w:rPr>
                 <w:t xml:space="preserve">7.2</w:t>
               </w:r>
-            </w:fldSimple>
+            </w:hyperlink>
             <w:r>
               <w:rPr>
                 <w:b w:val="false"/>
@@ -6015,11 +6147,17 @@
               </w:rPr>
               <w:t xml:space="preserve">Section </w:t>
             </w:r>
-            <w:fldSimple w:instr="REF sec_7_4 \w \h">
+            <w:hyperlink w:history="1" w:anchor="sec_7_4">
               <w:r>
+                <w:rPr>
+                  <w:b w:val="false"/>
+                  <w:bCs w:val="false"/>
+                  <w:i w:val="false"/>
+                  <w:iCs w:val="false"/>
+                </w:rPr>
                 <w:t xml:space="preserve">7.4</w:t>
               </w:r>
-            </w:fldSimple>
+            </w:hyperlink>
           </w:p>
         </w:tc>
         <w:tc>
@@ -6106,11 +6244,17 @@
               </w:rPr>
               <w:t xml:space="preserve">Section </w:t>
             </w:r>
-            <w:fldSimple w:instr="REF sec_7_3 \w \h">
+            <w:hyperlink w:history="1" w:anchor="sec_7_3">
               <w:r>
+                <w:rPr>
+                  <w:b w:val="false"/>
+                  <w:bCs w:val="false"/>
+                  <w:i w:val="false"/>
+                  <w:iCs w:val="false"/>
+                </w:rPr>
                 <w:t xml:space="preserve">7.3</w:t>
               </w:r>
-            </w:fldSimple>
+            </w:hyperlink>
           </w:p>
         </w:tc>
         <w:tc>
@@ -6283,11 +6427,17 @@
               </w:rPr>
               <w:t xml:space="preserve">Section </w:t>
             </w:r>
-            <w:fldSimple w:instr="REF sec_8_2 \w \h">
+            <w:hyperlink w:history="1" w:anchor="sec_8_2">
               <w:r>
+                <w:rPr>
+                  <w:b w:val="false"/>
+                  <w:bCs w:val="false"/>
+                  <w:i w:val="false"/>
+                  <w:iCs w:val="false"/>
+                </w:rPr>
                 <w:t xml:space="preserve">8.2</w:t>
               </w:r>
-            </w:fldSimple>
+            </w:hyperlink>
           </w:p>
         </w:tc>
         <w:tc>
@@ -6444,11 +6594,17 @@
         </w:rPr>
         <w:t xml:space="preserve">Section </w:t>
       </w:r>
-      <w:fldSimple w:instr="REF sec_4_2 \w \h">
+      <w:hyperlink w:history="1" w:anchor="sec_4_2">
         <w:r>
+          <w:rPr>
+            <w:b w:val="false"/>
+            <w:bCs w:val="false"/>
+            <w:i w:val="false"/>
+            <w:iCs w:val="false"/>
+          </w:rPr>
           <w:t xml:space="preserve">4.2</w:t>
         </w:r>
-      </w:fldSimple>
+      </w:hyperlink>
       <w:r>
         <w:rPr>
           <w:b w:val="false"/>
@@ -6495,11 +6651,17 @@
         </w:rPr>
         <w:t xml:space="preserve">Section </w:t>
       </w:r>
-      <w:fldSimple w:instr="REF sec_5_2 \w \h">
+      <w:hyperlink w:history="1" w:anchor="sec_5_2">
         <w:r>
+          <w:rPr>
+            <w:b w:val="false"/>
+            <w:bCs w:val="false"/>
+            <w:i w:val="false"/>
+            <w:iCs w:val="false"/>
+          </w:rPr>
           <w:t xml:space="preserve">5.2</w:t>
         </w:r>
-      </w:fldSimple>
+      </w:hyperlink>
       <w:r>
         <w:rPr>
           <w:b w:val="false"/>
@@ -6518,11 +6680,17 @@
         </w:rPr>
         <w:t xml:space="preserve">Section </w:t>
       </w:r>
-      <w:fldSimple w:instr="REF sec_5_3 \w \h">
+      <w:hyperlink w:history="1" w:anchor="sec_5_3">
         <w:r>
+          <w:rPr>
+            <w:b w:val="false"/>
+            <w:bCs w:val="false"/>
+            <w:i w:val="false"/>
+            <w:iCs w:val="false"/>
+          </w:rPr>
           <w:t xml:space="preserve">5.3</w:t>
         </w:r>
-      </w:fldSimple>
+      </w:hyperlink>
       <w:r>
         <w:rPr>
           <w:b w:val="false"/>
@@ -6569,11 +6737,17 @@
         </w:rPr>
         <w:t xml:space="preserve">Section </w:t>
       </w:r>
-      <w:fldSimple w:instr="REF sec_4_2 \w \h">
+      <w:hyperlink w:history="1" w:anchor="sec_4_2">
         <w:r>
+          <w:rPr>
+            <w:b w:val="false"/>
+            <w:bCs w:val="false"/>
+            <w:i w:val="false"/>
+            <w:iCs w:val="false"/>
+          </w:rPr>
           <w:t xml:space="preserve">4.2</w:t>
         </w:r>
-      </w:fldSimple>
+      </w:hyperlink>
       <w:r>
         <w:rPr>
           <w:b w:val="false"/>
@@ -6634,11 +6808,17 @@
         </w:rPr>
         <w:t xml:space="preserve">Section </w:t>
       </w:r>
-      <w:fldSimple w:instr="REF sec_4_3 \w \h">
+      <w:hyperlink w:history="1" w:anchor="sec_4_3">
         <w:r>
+          <w:rPr>
+            <w:b w:val="false"/>
+            <w:bCs w:val="false"/>
+            <w:i w:val="false"/>
+            <w:iCs w:val="false"/>
+          </w:rPr>
           <w:t xml:space="preserve">4.3</w:t>
         </w:r>
-      </w:fldSimple>
+      </w:hyperlink>
       <w:r>
         <w:rPr>
           <w:b w:val="false"/>
@@ -8433,11 +8613,17 @@
         </w:rPr>
         <w:t xml:space="preserve">Section </w:t>
       </w:r>
-      <w:fldSimple w:instr="REF sec_5_2 \w \h">
+      <w:hyperlink w:history="1" w:anchor="sec_5_2">
         <w:r>
+          <w:rPr>
+            <w:b w:val="false"/>
+            <w:bCs w:val="false"/>
+            <w:i w:val="false"/>
+            <w:iCs w:val="false"/>
+          </w:rPr>
           <w:t xml:space="preserve">5.2</w:t>
         </w:r>
-      </w:fldSimple>
+      </w:hyperlink>
       <w:r>
         <w:rPr>
           <w:b w:val="false"/>
@@ -11934,11 +12120,17 @@
               </w:rPr>
               <w:t xml:space="preserve">Section </w:t>
             </w:r>
-            <w:fldSimple w:instr="REF sec_6_2 \w \h">
+            <w:hyperlink w:history="1" w:anchor="sec_6_2">
               <w:r>
+                <w:rPr>
+                  <w:b w:val="false"/>
+                  <w:bCs w:val="false"/>
+                  <w:i w:val="false"/>
+                  <w:iCs w:val="false"/>
+                </w:rPr>
                 <w:t xml:space="preserve">6.2</w:t>
               </w:r>
-            </w:fldSimple>
+            </w:hyperlink>
           </w:p>
         </w:tc>
       </w:tr>
@@ -13118,11 +13310,17 @@
               </w:rPr>
               <w:t xml:space="preserve">Section </w:t>
             </w:r>
-            <w:fldSimple w:instr="REF sec_4_2 \w \h">
+            <w:hyperlink w:history="1" w:anchor="sec_4_2">
               <w:r>
+                <w:rPr>
+                  <w:b w:val="false"/>
+                  <w:bCs w:val="false"/>
+                  <w:i w:val="false"/>
+                  <w:iCs w:val="false"/>
+                </w:rPr>
                 <w:t xml:space="preserve">4.2</w:t>
               </w:r>
-            </w:fldSimple>
+            </w:hyperlink>
           </w:p>
         </w:tc>
       </w:tr>
@@ -13340,11 +13538,17 @@
               </w:rPr>
               <w:t xml:space="preserve">Section </w:t>
             </w:r>
-            <w:fldSimple w:instr="REF sec_7_3 \w \h">
+            <w:hyperlink w:history="1" w:anchor="sec_7_3">
               <w:r>
+                <w:rPr>
+                  <w:b w:val="false"/>
+                  <w:bCs w:val="false"/>
+                  <w:i w:val="false"/>
+                  <w:iCs w:val="false"/>
+                </w:rPr>
                 <w:t xml:space="preserve">7.3</w:t>
               </w:r>
-            </w:fldSimple>
+            </w:hyperlink>
             <w:r>
               <w:rPr>
                 <w:b w:val="false"/>
@@ -13363,11 +13567,17 @@
               </w:rPr>
               <w:t xml:space="preserve">Section </w:t>
             </w:r>
-            <w:fldSimple w:instr="REF sec_8_1 \w \h">
+            <w:hyperlink w:history="1" w:anchor="sec_8_1">
               <w:r>
+                <w:rPr>
+                  <w:b w:val="false"/>
+                  <w:bCs w:val="false"/>
+                  <w:i w:val="false"/>
+                  <w:iCs w:val="false"/>
+                </w:rPr>
                 <w:t xml:space="preserve">8.1</w:t>
               </w:r>
-            </w:fldSimple>
+            </w:hyperlink>
           </w:p>
         </w:tc>
       </w:tr>
@@ -21306,11 +21516,17 @@
         </w:rPr>
         <w:t xml:space="preserve">Section </w:t>
       </w:r>
-      <w:fldSimple w:instr="REF sec_7_3 \w \h">
+      <w:hyperlink w:history="1" w:anchor="sec_7_3">
         <w:r>
+          <w:rPr>
+            <w:b w:val="false"/>
+            <w:bCs w:val="false"/>
+            <w:i w:val="false"/>
+            <w:iCs w:val="false"/>
+          </w:rPr>
           <w:t xml:space="preserve">7.3</w:t>
         </w:r>
-      </w:fldSimple>
+      </w:hyperlink>
       <w:r>
         <w:rPr>
           <w:b w:val="false"/>
@@ -21878,11 +22094,17 @@
         </w:rPr>
         <w:t xml:space="preserve">Section </w:t>
       </w:r>
-      <w:fldSimple w:instr="REF sec_7_4 \w \h">
+      <w:hyperlink w:history="1" w:anchor="sec_7_4">
         <w:r>
+          <w:rPr>
+            <w:b w:val="false"/>
+            <w:bCs w:val="false"/>
+            <w:i w:val="false"/>
+            <w:iCs w:val="false"/>
+          </w:rPr>
           <w:t xml:space="preserve">7.4</w:t>
         </w:r>
-      </w:fldSimple>
+      </w:hyperlink>
       <w:r>
         <w:rPr>
           <w:b w:val="false"/>
@@ -21996,11 +22218,17 @@
         </w:rPr>
         <w:t xml:space="preserve">Section </w:t>
       </w:r>
-      <w:fldSimple w:instr="REF sec_2_1 \w \h">
+      <w:hyperlink w:history="1" w:anchor="sec_2_1">
         <w:r>
+          <w:rPr>
+            <w:b w:val="false"/>
+            <w:bCs w:val="false"/>
+            <w:i w:val="false"/>
+            <w:iCs w:val="false"/>
+          </w:rPr>
           <w:t xml:space="preserve">2.1</w:t>
         </w:r>
-      </w:fldSimple>
+      </w:hyperlink>
       <w:r>
         <w:rPr>
           <w:b w:val="false"/>
@@ -22193,11 +22421,17 @@
               </w:rPr>
               <w:t xml:space="preserve">Section </w:t>
             </w:r>
-            <w:fldSimple w:instr="REF sec_3_1 \w \h">
+            <w:hyperlink w:history="1" w:anchor="sec_3_1">
               <w:r>
+                <w:rPr>
+                  <w:b w:val="false"/>
+                  <w:bCs w:val="false"/>
+                  <w:i w:val="false"/>
+                  <w:iCs w:val="false"/>
+                </w:rPr>
                 <w:t xml:space="preserve">3.1</w:t>
               </w:r>
-            </w:fldSimple>
+            </w:hyperlink>
           </w:p>
         </w:tc>
       </w:tr>
@@ -22505,11 +22739,17 @@
               </w:rPr>
               <w:t xml:space="preserve">Section </w:t>
             </w:r>
-            <w:fldSimple w:instr="REF sec_6_2 \w \h">
+            <w:hyperlink w:history="1" w:anchor="sec_6_2">
               <w:r>
+                <w:rPr>
+                  <w:b w:val="false"/>
+                  <w:bCs w:val="false"/>
+                  <w:i w:val="false"/>
+                  <w:iCs w:val="false"/>
+                </w:rPr>
                 <w:t xml:space="preserve">6.2</w:t>
               </w:r>
-            </w:fldSimple>
+            </w:hyperlink>
           </w:p>
         </w:tc>
       </w:tr>
@@ -22808,11 +23048,17 @@
               </w:rPr>
               <w:t xml:space="preserve">Sections </w:t>
             </w:r>
-            <w:fldSimple w:instr="REF sec_6_2 \w \h">
+            <w:hyperlink w:history="1" w:anchor="sec_6_2">
               <w:r>
+                <w:rPr>
+                  <w:b w:val="false"/>
+                  <w:bCs w:val="false"/>
+                  <w:i w:val="false"/>
+                  <w:iCs w:val="false"/>
+                </w:rPr>
                 <w:t xml:space="preserve">6.2</w:t>
               </w:r>
-            </w:fldSimple>
+            </w:hyperlink>
             <w:r>
               <w:rPr>
                 <w:b w:val="false"/>
@@ -22822,11 +23068,17 @@
               </w:rPr>
               <w:t xml:space="preserve"> and </w:t>
             </w:r>
-            <w:fldSimple w:instr="REF sec_6_3 \w \h">
+            <w:hyperlink w:history="1" w:anchor="sec_6_3">
               <w:r>
+                <w:rPr>
+                  <w:b w:val="false"/>
+                  <w:bCs w:val="false"/>
+                  <w:i w:val="false"/>
+                  <w:iCs w:val="false"/>
+                </w:rPr>
                 <w:t xml:space="preserve">6.3</w:t>
               </w:r>
-            </w:fldSimple>
+            </w:hyperlink>
           </w:p>
         </w:tc>
       </w:tr>
@@ -22985,11 +23237,17 @@
               </w:rPr>
               <w:t xml:space="preserve">Section </w:t>
             </w:r>
-            <w:fldSimple w:instr="REF sec_9_3 \w \h">
+            <w:hyperlink w:history="1" w:anchor="sec_9_3">
               <w:r>
+                <w:rPr>
+                  <w:b w:val="false"/>
+                  <w:bCs w:val="false"/>
+                  <w:i w:val="false"/>
+                  <w:iCs w:val="false"/>
+                </w:rPr>
                 <w:t xml:space="preserve">9.3</w:t>
               </w:r>
-            </w:fldSimple>
+            </w:hyperlink>
           </w:p>
         </w:tc>
       </w:tr>
@@ -23121,11 +23379,17 @@
               </w:rPr>
               <w:t xml:space="preserve">Section </w:t>
             </w:r>
-            <w:fldSimple w:instr="REF sec_3_2 \w \h">
+            <w:hyperlink w:history="1" w:anchor="sec_3_2">
               <w:r>
+                <w:rPr>
+                  <w:b w:val="false"/>
+                  <w:bCs w:val="false"/>
+                  <w:i w:val="false"/>
+                  <w:iCs w:val="false"/>
+                </w:rPr>
                 <w:t xml:space="preserve">3.2</w:t>
               </w:r>
-            </w:fldSimple>
+            </w:hyperlink>
             <w:r>
               <w:rPr>
                 <w:b w:val="false"/>
@@ -23284,11 +23548,17 @@
               </w:rPr>
               <w:t xml:space="preserve">Section </w:t>
             </w:r>
-            <w:fldSimple w:instr="REF sec_11_1 \w \h">
+            <w:hyperlink w:history="1" w:anchor="sec_11_1">
               <w:r>
+                <w:rPr>
+                  <w:b w:val="false"/>
+                  <w:bCs w:val="false"/>
+                  <w:i w:val="false"/>
+                  <w:iCs w:val="false"/>
+                </w:rPr>
                 <w:t xml:space="preserve">11.1</w:t>
               </w:r>
-            </w:fldSimple>
+            </w:hyperlink>
             <w:r>
               <w:rPr>
                 <w:b w:val="false"/>
@@ -23377,11 +23647,17 @@
               </w:rPr>
               <w:t xml:space="preserve">Sections </w:t>
             </w:r>
-            <w:fldSimple w:instr="REF sec_2_1 \w \h">
+            <w:hyperlink w:history="1" w:anchor="sec_2_1">
               <w:r>
+                <w:rPr>
+                  <w:b w:val="false"/>
+                  <w:bCs w:val="false"/>
+                  <w:i w:val="false"/>
+                  <w:iCs w:val="false"/>
+                </w:rPr>
                 <w:t xml:space="preserve">2.1</w:t>
               </w:r>
-            </w:fldSimple>
+            </w:hyperlink>
             <w:r>
               <w:rPr>
                 <w:b w:val="false"/>
@@ -23391,11 +23667,17 @@
               </w:rPr>
               <w:t xml:space="preserve"> and </w:t>
             </w:r>
-            <w:fldSimple w:instr="REF sec_11_1 \w \h">
+            <w:hyperlink w:history="1" w:anchor="sec_11_1">
               <w:r>
+                <w:rPr>
+                  <w:b w:val="false"/>
+                  <w:bCs w:val="false"/>
+                  <w:i w:val="false"/>
+                  <w:iCs w:val="false"/>
+                </w:rPr>
                 <w:t xml:space="preserve">11.1</w:t>
               </w:r>
-            </w:fldSimple>
+            </w:hyperlink>
           </w:p>
         </w:tc>
       </w:tr>
@@ -23466,11 +23748,17 @@
               </w:rPr>
               <w:t xml:space="preserve">Section </w:t>
             </w:r>
-            <w:fldSimple w:instr="REF sec_6_3 \w \h">
+            <w:hyperlink w:history="1" w:anchor="sec_6_3">
               <w:r>
+                <w:rPr>
+                  <w:b w:val="false"/>
+                  <w:bCs w:val="false"/>
+                  <w:i w:val="false"/>
+                  <w:iCs w:val="false"/>
+                </w:rPr>
                 <w:t xml:space="preserve">6.3</w:t>
               </w:r>
-            </w:fldSimple>
+            </w:hyperlink>
           </w:p>
         </w:tc>
       </w:tr>

</xml_diff>